<commit_message>
Polish screenshot chrome: Dark Modern theme, default font sizes, layout controls
Switch the rendered workbench from classic Dark+ to Dark Modern, the
default theme of a current VS Code install: dark title and status bars
with subtle borders, #1f1f1f editor background, and the blue accent
reduced to the active tab's top border. Token colours are unchanged,
as Dark Modern inherits them from Dark+.

Editor and terminal move to the default 14px font size. The title bar
gains the layout-control cluster next to the window buttons, the tab bar
gains the split-editor and more-actions buttons, and the activity-bar
gear, search and extensions glyphs are redrawn closer to the real
codicons. The screenshot integrity check now verifies the Dark Modern
status bar instead of the old blue one.
</commit_message>
<xml_diff>
--- a/lab-final-tasks/AI_Final_Lab_Task_Minhazul_21-44625-1.docx
+++ b/lab-final-tasks/AI_Final_Lab_Task_Minhazul_21-44625-1.docx
@@ -108,7 +108,7 @@
       <w:r>
         <w:drawing>
           <wp:inline distT="0" distB="0" distL="0" distR="0">
-            <wp:extent cx="5715000" cy="4295775"/>
+            <wp:extent cx="5715000" cy="4105275"/>
             <wp:effectExtent t="0" r="0" b="0" l="0"/>
             <wp:docPr id="1" name="" descr="" title=""/>
             <wp:cNvGraphicFramePr>
@@ -133,7 +133,7 @@
                   <pic:spPr bwMode="auto">
                     <a:xfrm>
                       <a:off x="0" y="0"/>
-                      <a:ext cx="5715000" cy="4295775"/>
+                      <a:ext cx="5715000" cy="4105275"/>
                     </a:xfrm>
                     <a:prstGeom prst="rect">
                       <a:avLst/>
@@ -153,7 +153,7 @@
       <w:r>
         <w:drawing>
           <wp:inline distT="0" distB="0" distL="0" distR="0">
-            <wp:extent cx="5715000" cy="4295775"/>
+            <wp:extent cx="5715000" cy="4105275"/>
             <wp:effectExtent t="0" r="0" b="0" l="0"/>
             <wp:docPr id="1" name="" descr="" title=""/>
             <wp:cNvGraphicFramePr>
@@ -178,7 +178,7 @@
                   <pic:spPr bwMode="auto">
                     <a:xfrm>
                       <a:off x="0" y="0"/>
-                      <a:ext cx="5715000" cy="4295775"/>
+                      <a:ext cx="5715000" cy="4105275"/>
                     </a:xfrm>
                     <a:prstGeom prst="rect">
                       <a:avLst/>
@@ -212,7 +212,7 @@
       <w:r>
         <w:drawing>
           <wp:inline distT="0" distB="0" distL="0" distR="0">
-            <wp:extent cx="5715000" cy="1562100"/>
+            <wp:extent cx="5715000" cy="1638300"/>
             <wp:effectExtent t="0" r="0" b="0" l="0"/>
             <wp:docPr id="1" name="" descr="" title=""/>
             <wp:cNvGraphicFramePr>
@@ -237,7 +237,7 @@
                   <pic:spPr bwMode="auto">
                     <a:xfrm>
                       <a:off x="0" y="0"/>
-                      <a:ext cx="5715000" cy="1562100"/>
+                      <a:ext cx="5715000" cy="1638300"/>
                     </a:xfrm>
                     <a:prstGeom prst="rect">
                       <a:avLst/>
@@ -1039,7 +1039,7 @@
       <w:r>
         <w:drawing>
           <wp:inline distT="0" distB="0" distL="0" distR="0">
-            <wp:extent cx="5715000" cy="4295775"/>
+            <wp:extent cx="5715000" cy="4105275"/>
             <wp:effectExtent t="0" r="0" b="0" l="0"/>
             <wp:docPr id="1" name="" descr="" title=""/>
             <wp:cNvGraphicFramePr>
@@ -1064,7 +1064,7 @@
                   <pic:spPr bwMode="auto">
                     <a:xfrm>
                       <a:off x="0" y="0"/>
-                      <a:ext cx="5715000" cy="4295775"/>
+                      <a:ext cx="5715000" cy="4105275"/>
                     </a:xfrm>
                     <a:prstGeom prst="rect">
                       <a:avLst/>
@@ -1084,7 +1084,7 @@
       <w:r>
         <w:drawing>
           <wp:inline distT="0" distB="0" distL="0" distR="0">
-            <wp:extent cx="5715000" cy="4295775"/>
+            <wp:extent cx="5715000" cy="4105275"/>
             <wp:effectExtent t="0" r="0" b="0" l="0"/>
             <wp:docPr id="1" name="" descr="" title=""/>
             <wp:cNvGraphicFramePr>
@@ -1109,7 +1109,7 @@
                   <pic:spPr bwMode="auto">
                     <a:xfrm>
                       <a:off x="0" y="0"/>
-                      <a:ext cx="5715000" cy="4295775"/>
+                      <a:ext cx="5715000" cy="4105275"/>
                     </a:xfrm>
                     <a:prstGeom prst="rect">
                       <a:avLst/>
@@ -1143,7 +1143,7 @@
       <w:r>
         <w:drawing>
           <wp:inline distT="0" distB="0" distL="0" distR="0">
-            <wp:extent cx="4953000" cy="4305300"/>
+            <wp:extent cx="4953000" cy="4543425"/>
             <wp:effectExtent t="0" r="0" b="0" l="0"/>
             <wp:docPr id="1" name="" descr="" title=""/>
             <wp:cNvGraphicFramePr>
@@ -1168,7 +1168,7 @@
                   <pic:spPr bwMode="auto">
                     <a:xfrm>
                       <a:off x="0" y="0"/>
-                      <a:ext cx="4953000" cy="4305300"/>
+                      <a:ext cx="4953000" cy="4543425"/>
                     </a:xfrm>
                     <a:prstGeom prst="rect">
                       <a:avLst/>
@@ -1188,7 +1188,7 @@
       <w:r>
         <w:drawing>
           <wp:inline distT="0" distB="0" distL="0" distR="0">
-            <wp:extent cx="4953000" cy="4219575"/>
+            <wp:extent cx="4953000" cy="4448175"/>
             <wp:effectExtent t="0" r="0" b="0" l="0"/>
             <wp:docPr id="1" name="" descr="" title=""/>
             <wp:cNvGraphicFramePr>
@@ -1213,7 +1213,7 @@
                   <pic:spPr bwMode="auto">
                     <a:xfrm>
                       <a:off x="0" y="0"/>
-                      <a:ext cx="4953000" cy="4219575"/>
+                      <a:ext cx="4953000" cy="4448175"/>
                     </a:xfrm>
                     <a:prstGeom prst="rect">
                       <a:avLst/>
@@ -1233,7 +1233,7 @@
       <w:r>
         <w:drawing>
           <wp:inline distT="0" distB="0" distL="0" distR="0">
-            <wp:extent cx="4953000" cy="4305300"/>
+            <wp:extent cx="4953000" cy="4543425"/>
             <wp:effectExtent t="0" r="0" b="0" l="0"/>
             <wp:docPr id="1" name="" descr="" title=""/>
             <wp:cNvGraphicFramePr>
@@ -1258,7 +1258,7 @@
                   <pic:spPr bwMode="auto">
                     <a:xfrm>
                       <a:off x="0" y="0"/>
-                      <a:ext cx="4953000" cy="4305300"/>
+                      <a:ext cx="4953000" cy="4543425"/>
                     </a:xfrm>
                     <a:prstGeom prst="rect">
                       <a:avLst/>

</xml_diff>